<commit_message>
docs: harmonize KoshSetu specs, state machine enums, Indian banking realities & roadmap
- Update AICTE_SIH26265_Backend.docx to KoshSetu Version 3.0 Brand Identity Edition
- Harmonize state machine enums across 7 canonical dimensions in README.md & backend spec
- Add Indian banking FDR extraction details (OpenCV adaptive thresholding, stamp segmentation, bilingual OCR)
- Add production bank connectivity roadmap (NeSL, SFMS, Account Aggregator)
- Map multi-tenant RBAC to AICTE Regional Offices (NRO, WRO, SRO, etc.) and Bureau Clearances
- Add comprehensive Markdown specifications in docs/backend-specification.md and docs/frontend-specification.md
</commit_message>
<xml_diff>
--- a/AICTE_SIH26265_Backend.docx
+++ b/AICTE_SIH26265_Backend.docx
@@ -8,19 +8,7 @@
         <w:jc w:val="center"/>
       </w:pPr>
       <w:r>
-        <w:t xml:space="preserve">AICTE</w:t>
-      </w:r>
-      <w:r>
-        <w:t xml:space="preserve"> </w:t>
-      </w:r>
-      <w:r>
-        <w:t xml:space="preserve">FDR</w:t>
-      </w:r>
-      <w:r>
-        <w:t xml:space="preserve"> </w:t>
-      </w:r>
-      <w:r>
-        <w:t xml:space="preserve">PORTAL</w:t>
+        <w:t>KoshSetu</w:t>
       </w:r>
     </w:p>
     <w:p>
@@ -29,49 +17,7 @@
         <w:jc w:val="center"/>
       </w:pPr>
       <w:r>
-        <w:t xml:space="preserve">Backend</w:t>
-      </w:r>
-      <w:r>
-        <w:t xml:space="preserve"> </w:t>
-      </w:r>
-      <w:r>
-        <w:t xml:space="preserve">Architecture,</w:t>
-      </w:r>
-      <w:r>
-        <w:t xml:space="preserve"> </w:t>
-      </w:r>
-      <w:r>
-        <w:t xml:space="preserve">Security</w:t>
-      </w:r>
-      <w:r>
-        <w:t xml:space="preserve"> </w:t>
-      </w:r>
-      <w:r>
-        <w:t xml:space="preserve">&amp;</w:t>
-      </w:r>
-      <w:r>
-        <w:t xml:space="preserve"> </w:t>
-      </w:r>
-      <w:r>
-        <w:t xml:space="preserve">API</w:t>
-      </w:r>
-      <w:r>
-        <w:t xml:space="preserve"> </w:t>
-      </w:r>
-      <w:r>
-        <w:t xml:space="preserve">Specification</w:t>
-      </w:r>
-      <w:r>
-        <w:t xml:space="preserve"> </w:t>
-      </w:r>
-      <w:r>
-        <w:t xml:space="preserve">|</w:t>
-      </w:r>
-      <w:r>
-        <w:t xml:space="preserve"> </w:t>
-      </w:r>
-      <w:r>
-        <w:t xml:space="preserve">SIH26265</w:t>
+        <w:t>AICTE Security Deposit / FDR Management Portal — Backend Architecture, Security &amp; API Specification | SIH26265</w:t>
       </w:r>
     </w:p>
     <w:p>
@@ -125,37 +71,7 @@
         <w:jc w:val="center"/>
       </w:pPr>
       <w:r>
-        <w:t xml:space="preserve">26</w:t>
-      </w:r>
-      <w:r>
-        <w:t xml:space="preserve"> </w:t>
-      </w:r>
-      <w:r>
-        <w:t xml:space="preserve">October</w:t>
-      </w:r>
-      <w:r>
-        <w:t xml:space="preserve"> </w:t>
-      </w:r>
-      <w:r>
-        <w:t xml:space="preserve">2026</w:t>
-      </w:r>
-      <w:r>
-        <w:t xml:space="preserve"> </w:t>
-      </w:r>
-      <w:r>
-        <w:t xml:space="preserve">|</w:t>
-      </w:r>
-      <w:r>
-        <w:t xml:space="preserve"> </w:t>
-      </w:r>
-      <w:r>
-        <w:t xml:space="preserve">Version</w:t>
-      </w:r>
-      <w:r>
-        <w:t xml:space="preserve"> </w:t>
-      </w:r>
-      <w:r>
-        <w:t xml:space="preserve">2.0</w:t>
+        <w:t>26 October 2026 | Version 3.0 — Brand Identity Edition</w:t>
       </w:r>
     </w:p>
     <w:p>
@@ -183,49 +99,13 @@
         <w:pStyle w:val="FirstParagraph"/>
       </w:pPr>
       <w:r>
-        <w:rPr>
-          <w:b/>
-          <w:bCs/>
-        </w:rPr>
-        <w:t xml:space="preserve">Status:</w:t>
-      </w:r>
-      <w:r>
-        <w:t xml:space="preserve"> </w:t>
-      </w:r>
-      <w:r>
-        <w:t xml:space="preserve">Implementation-ready design brief (prototype; subject to AICTE and policy-owner validation)</w:t>
-      </w:r>
-      <w:r>
-        <w:br/>
-      </w:r>
-      <w:r>
-        <w:rPr>
-          <w:b/>
-          <w:bCs/>
-        </w:rPr>
-        <w:t xml:space="preserve">Prepared:</w:t>
-      </w:r>
-      <w:r>
-        <w:t xml:space="preserve"> </w:t>
-      </w:r>
-      <w:r>
-        <w:t xml:space="preserve">26 October 2026</w:t>
-      </w:r>
-      <w:r>
-        <w:br/>
-      </w:r>
-      <w:r>
-        <w:rPr>
-          <w:b/>
-          <w:bCs/>
-        </w:rPr>
-        <w:t xml:space="preserve">Companion document:</w:t>
-      </w:r>
-      <w:r>
-        <w:t xml:space="preserve"> </w:t>
-      </w:r>
-      <w:r>
-        <w:t xml:space="preserve">Frontend Product &amp; UI/UX Specification</w:t>
+        <w:t>Status: Implementation-ready design brief (prototype; subject to AICTE and policy-owner validation)</w:t>
+        <w:br/>
+        <w:t>Prepared: 26 October 2026</w:t>
+        <w:br/>
+        <w:t>Companion document: Frontend Product &amp; UI/UX Specification</w:t>
+        <w:br/>
+        <w:t>Project brand: KoshSetu — Secure deposits. Traceable decisions. Independent SIH prototype; not an official AICTE or bank platform.</w:t>
       </w:r>
     </w:p>
     <w:bookmarkStart w:id="20" w:name="problem-statement-and-engineering-scope"/>
@@ -7022,7 +6902,10 @@
         <w:keepNext/>
       </w:pPr>
       <w:r>
-        <w:t xml:space="preserve">7.3 Simulation scenarios and UI alignment</w:t>
+        <w:t>7.3 Simulation scenarios and UI alignment</w:t>
+        <w:br/>
+        <w:br/>
+        <w:t>Production Roadmap: Bank Connectivity Pathways: While the prototype enforces strict MOCK_BANK simulation boundaries, a production government deployment bridges to banking infrastructure via: (1) NeSL (National E-Governance Services Ltd) for digital lien recording and verifiable institutional collateral registry under IBC; (2) SFMS (Structured Financial Messaging System) via IDRBT/RBI for secure inter-bank lien advisory messaging; (3) Account Aggregator (AA) framework for consent-based deposit verification; and (4) DigiLocker/NeGD for verified certificate ingestion.</w:t>
       </w:r>
     </w:p>
     <w:tbl>
@@ -9123,7 +9006,10 @@
         <w:keepNext/>
       </w:pPr>
       <w:r>
-        <w:t xml:space="preserve">10.3 Four-eye rule and blocking checks</w:t>
+        <w:t>10.3 Four-eye rule and blocking checks</w:t>
+        <w:br/>
+        <w:br/>
+        <w:t>AICTE Bureau Clearances &amp; Regional Offices: Multi-tenant scoping maps to AICTE Regional Offices (NRO Kanpur, WRO Mumbai, SRO Chennai, SWRO Bangalore, CRO Bhopal, ERO Kolkata, NWRO Chandigarh). Release requests enforce prerequisite signoffs from: CLEARANCE_APPROVAL_BUREAU (institutional intake compliance), CLEARANCE_FINANCE_BUREAU (no outstanding institutional dues/penalties), and CLEARANCE_LEGAL_CELL (no court injunctions or litigation holds) before the Approving Authority (Checker) can approve.</w:t>
       </w:r>
     </w:p>
     <w:p>
@@ -16570,171 +16456,42 @@
         <w:spacing w:before="60" w:after="100"/>
       </w:pPr>
       <w:r>
-        <w:rPr>
-          <w:rStyle w:val="VerbatimChar"/>
-        </w:rPr>
-        <w:t xml:space="preserve">fdr-platform/</w:t>
-      </w:r>
-      <w:r>
-        <w:br/>
-      </w:r>
-      <w:r>
-        <w:rPr>
-          <w:rStyle w:val="VerbatimChar"/>
-        </w:rPr>
+        <w:t>koshsetu/</w:t>
+        <w:br/>
         <w:t xml:space="preserve">  apps/</w:t>
-      </w:r>
-      <w:r>
-        <w:br/>
-      </w:r>
-      <w:r>
-        <w:rPr>
-          <w:rStyle w:val="VerbatimChar"/>
-        </w:rPr>
+        <w:br/>
         <w:t xml:space="preserve">    api/app/</w:t>
-      </w:r>
-      <w:r>
-        <w:br/>
-      </w:r>
-      <w:r>
-        <w:rPr>
-          <w:rStyle w:val="VerbatimChar"/>
-        </w:rPr>
+        <w:br/>
         <w:t xml:space="preserve">      main.py</w:t>
-      </w:r>
-      <w:r>
-        <w:br/>
-      </w:r>
-      <w:r>
-        <w:rPr>
-          <w:rStyle w:val="VerbatimChar"/>
-        </w:rPr>
+        <w:br/>
         <w:t xml:space="preserve">      api/v1/{fdrs,uploads,verification,releases,notifications}.py</w:t>
-      </w:r>
-      <w:r>
-        <w:br/>
-      </w:r>
-      <w:r>
-        <w:rPr>
-          <w:rStyle w:val="VerbatimChar"/>
-        </w:rPr>
+        <w:br/>
         <w:t xml:space="preserve">      core/{settings,security,permissions,logging}.py</w:t>
-      </w:r>
-      <w:r>
-        <w:br/>
-      </w:r>
-      <w:r>
-        <w:rPr>
-          <w:rStyle w:val="VerbatimChar"/>
-        </w:rPr>
+        <w:br/>
         <w:t xml:space="preserve">      db/{base,session,models,migrations}.py</w:t>
-      </w:r>
-      <w:r>
-        <w:br/>
-      </w:r>
-      <w:r>
-        <w:rPr>
-          <w:rStyle w:val="VerbatimChar"/>
-        </w:rPr>
+        <w:br/>
         <w:t xml:space="preserve">      domains/</w:t>
-      </w:r>
-      <w:r>
-        <w:br/>
-      </w:r>
-      <w:r>
-        <w:rPr>
-          <w:rStyle w:val="VerbatimChar"/>
-        </w:rPr>
+        <w:br/>
         <w:t xml:space="preserve">        fdr/{schema,service,repository,policy}.py</w:t>
-      </w:r>
-      <w:r>
-        <w:br/>
-      </w:r>
-      <w:r>
-        <w:rPr>
-          <w:rStyle w:val="VerbatimChar"/>
-        </w:rPr>
+        <w:br/>
         <w:t xml:space="preserve">        document/{upload,scan,extract,evidence}.py</w:t>
-      </w:r>
-      <w:r>
-        <w:br/>
-      </w:r>
-      <w:r>
-        <w:rPr>
-          <w:rStyle w:val="VerbatimChar"/>
-        </w:rPr>
+        <w:br/>
         <w:t xml:space="preserve">        bank/{ports,mock_adapter,bank_adapter}.py</w:t>
-      </w:r>
-      <w:r>
-        <w:br/>
-      </w:r>
-      <w:r>
-        <w:rPr>
-          <w:rStyle w:val="VerbatimChar"/>
-        </w:rPr>
+        <w:br/>
         <w:t xml:space="preserve">        release/{service,policy,events}.py</w:t>
-      </w:r>
-      <w:r>
-        <w:br/>
-      </w:r>
-      <w:r>
-        <w:rPr>
-          <w:rStyle w:val="VerbatimChar"/>
-        </w:rPr>
+        <w:br/>
         <w:t xml:space="preserve">        risk/{rules,engine}.py</w:t>
-      </w:r>
-      <w:r>
-        <w:br/>
-      </w:r>
-      <w:r>
-        <w:rPr>
-          <w:rStyle w:val="VerbatimChar"/>
-        </w:rPr>
+        <w:br/>
         <w:t xml:space="preserve">        notification/{service,events}.py</w:t>
-      </w:r>
-      <w:r>
-        <w:br/>
-      </w:r>
-      <w:r>
-        <w:rPr>
-          <w:rStyle w:val="VerbatimChar"/>
-        </w:rPr>
+        <w:br/>
         <w:t xml:space="preserve">      workers/{celery_app,tasks,beat_schedule}.py</w:t>
-      </w:r>
-      <w:r>
-        <w:br/>
-      </w:r>
-      <w:r>
-        <w:rPr>
-          <w:rStyle w:val="VerbatimChar"/>
-        </w:rPr>
+        <w:br/>
         <w:t xml:space="preserve">    web/                 # Next.js App Router, BFF, UI</w:t>
-      </w:r>
-      <w:r>
-        <w:br/>
-      </w:r>
-      <w:r>
-        <w:rPr>
-          <w:rStyle w:val="VerbatimChar"/>
-        </w:rPr>
+        <w:br/>
         <w:t xml:space="preserve">  tests/{unit,integration,security,e2e}/</w:t>
-      </w:r>
-      <w:r>
-        <w:br/>
-      </w:r>
-      <w:r>
-        <w:rPr>
-          <w:rStyle w:val="VerbatimChar"/>
-        </w:rPr>
+        <w:br/>
         <w:t xml:space="preserve">  infra/{containers,iam,network,monitoring}/</w:t>
-      </w:r>
-      <w:r>
-        <w:br/>
-      </w:r>
-      <w:r>
-        <w:rPr>
-          <w:rStyle w:val="VerbatimChar"/>
-        </w:rPr>
+        <w:br/>
         <w:t xml:space="preserve">  docs/{openapi,adr,threat-model,runbooks}/</w:t>
       </w:r>
     </w:p>
@@ -21072,7 +20829,10 @@
         <w:keepNext/>
       </w:pPr>
       <w:r>
-        <w:t xml:space="preserve">19.8 OCR pipeline: extraction is not bank authentication</w:t>
+        <w:t>19.8 OCR pipeline: extraction is not bank authentication</w:t>
+        <w:br/>
+        <w:br/>
+        <w:t>Indian Banking Document Realities: Physical FDR receipts from Indian banks (SBI, PNB, Canara, etc.) often feature colored rubber stamps over FDR numbers or principal amounts, bilingual layouts (Hindi/English), and low-contrast dot-matrix printing. Preprocessing utilizes OpenCV color thresholding (HSV space) to isolate text from colored ink stamps, and Tesseract is configured for eng+hin. Any extracted field with confidence &lt; 0.85 requires mandatory visual human-in-the-loop confirmation.</w:t>
       </w:r>
     </w:p>
     <w:p>
@@ -22521,979 +22281,84 @@
         <w:spacing w:before="60" w:after="100"/>
       </w:pPr>
       <w:r>
-        <w:rPr>
-          <w:rStyle w:val="ImportTok"/>
-        </w:rPr>
-        <w:t xml:space="preserve">from</w:t>
-      </w:r>
-      <w:r>
-        <w:rPr>
-          <w:rStyle w:val="NormalTok"/>
-        </w:rPr>
-        <w:t xml:space="preserve"> uuid </w:t>
-      </w:r>
-      <w:r>
-        <w:rPr>
-          <w:rStyle w:val="ImportTok"/>
-        </w:rPr>
-        <w:t xml:space="preserve">import</w:t>
-      </w:r>
-      <w:r>
-        <w:rPr>
-          <w:rStyle w:val="NormalTok"/>
-        </w:rPr>
-        <w:t xml:space="preserve"> UUID</w:t>
-      </w:r>
-      <w:r>
-        <w:br/>
-      </w:r>
-      <w:r>
-        <w:rPr>
-          <w:rStyle w:val="ImportTok"/>
-        </w:rPr>
-        <w:t xml:space="preserve">from</w:t>
-      </w:r>
-      <w:r>
-        <w:rPr>
-          <w:rStyle w:val="NormalTok"/>
-        </w:rPr>
-        <w:t xml:space="preserve"> sqlalchemy </w:t>
-      </w:r>
-      <w:r>
-        <w:rPr>
-          <w:rStyle w:val="ImportTok"/>
-        </w:rPr>
-        <w:t xml:space="preserve">import</w:t>
-      </w:r>
-      <w:r>
-        <w:rPr>
-          <w:rStyle w:val="NormalTok"/>
-        </w:rPr>
-        <w:t xml:space="preserve"> select</w:t>
-      </w:r>
-      <w:r>
-        <w:br/>
-      </w:r>
-      <w:r>
-        <w:rPr>
-          <w:rStyle w:val="ImportTok"/>
-        </w:rPr>
-        <w:t xml:space="preserve">from</w:t>
-      </w:r>
-      <w:r>
-        <w:rPr>
-          <w:rStyle w:val="NormalTok"/>
-        </w:rPr>
-        <w:t xml:space="preserve"> sqlalchemy.ext.asyncio </w:t>
-      </w:r>
-      <w:r>
-        <w:rPr>
-          <w:rStyle w:val="ImportTok"/>
-        </w:rPr>
-        <w:t xml:space="preserve">import</w:t>
-      </w:r>
-      <w:r>
-        <w:rPr>
-          <w:rStyle w:val="NormalTok"/>
-        </w:rPr>
-        <w:t xml:space="preserve"> AsyncSession</w:t>
-      </w:r>
-      <w:r>
-        <w:br/>
-      </w:r>
-      <w:r>
-        <w:br/>
-      </w:r>
-      <w:r>
-        <w:rPr>
-          <w:rStyle w:val="ControlFlowTok"/>
-        </w:rPr>
-        <w:t xml:space="preserve">async</w:t>
-      </w:r>
-      <w:r>
-        <w:rPr>
-          <w:rStyle w:val="NormalTok"/>
-        </w:rPr>
-        <w:t xml:space="preserve"> </w:t>
-      </w:r>
-      <w:r>
-        <w:rPr>
-          <w:rStyle w:val="KeywordTok"/>
-        </w:rPr>
-        <w:t xml:space="preserve">def</w:t>
-      </w:r>
-      <w:r>
-        <w:rPr>
-          <w:rStyle w:val="NormalTok"/>
-        </w:rPr>
-        <w:t xml:space="preserve"> final_approve_release(</w:t>
-      </w:r>
-      <w:r>
-        <w:br/>
-      </w:r>
-      <w:r>
-        <w:rPr>
-          <w:rStyle w:val="NormalTok"/>
-        </w:rPr>
+        <w:t>from uuid import UUID</w:t>
+        <w:br/>
+        <w:t>from sqlalchemy import select</w:t>
+        <w:br/>
+        <w:t>from sqlalchemy.ext.asyncio import AsyncSession</w:t>
+        <w:br/>
+        <w:br/>
+        <w:t>async def final_approve_release(</w:t>
+        <w:br/>
         <w:t xml:space="preserve">    db: AsyncSession,</w:t>
-      </w:r>
-      <w:r>
-        <w:br/>
-      </w:r>
-      <w:r>
-        <w:rPr>
-          <w:rStyle w:val="NormalTok"/>
-        </w:rPr>
+        <w:br/>
         <w:t xml:space="preserve">    request_id: UUID,</w:t>
-      </w:r>
-      <w:r>
-        <w:br/>
-      </w:r>
-      <w:r>
-        <w:rPr>
-          <w:rStyle w:val="NormalTok"/>
-        </w:rPr>
+        <w:br/>
         <w:t xml:space="preserve">    checker_id: UUID,</w:t>
-      </w:r>
-      <w:r>
-        <w:br/>
-      </w:r>
-      <w:r>
-        <w:rPr>
-          <w:rStyle w:val="NormalTok"/>
-        </w:rPr>
-        <w:t xml:space="preserve">    idempotency_key: </w:t>
-      </w:r>
-      <w:r>
-        <w:rPr>
-          <w:rStyle w:val="BuiltInTok"/>
-        </w:rPr>
-        <w:t xml:space="preserve">str</w:t>
-      </w:r>
-      <w:r>
-        <w:rPr>
-          <w:rStyle w:val="NormalTok"/>
-        </w:rPr>
-        <w:t xml:space="preserve">,</w:t>
-      </w:r>
-      <w:r>
-        <w:br/>
-      </w:r>
-      <w:r>
-        <w:rPr>
-          <w:rStyle w:val="NormalTok"/>
-        </w:rPr>
-        <w:t xml:space="preserve">) </w:t>
-      </w:r>
-      <w:r>
-        <w:rPr>
-          <w:rStyle w:val="OperatorTok"/>
-        </w:rPr>
-        <w:t xml:space="preserve">-&gt;</w:t>
-      </w:r>
-      <w:r>
-        <w:rPr>
-          <w:rStyle w:val="NormalTok"/>
-        </w:rPr>
-        <w:t xml:space="preserve"> </w:t>
-      </w:r>
-      <w:r>
-        <w:rPr>
-          <w:rStyle w:val="BuiltInTok"/>
-        </w:rPr>
-        <w:t xml:space="preserve">dict</w:t>
-      </w:r>
-      <w:r>
-        <w:rPr>
-          <w:rStyle w:val="NormalTok"/>
-        </w:rPr>
-        <w:t xml:space="preserve">:</w:t>
-      </w:r>
-      <w:r>
-        <w:br/>
-      </w:r>
-      <w:r>
-        <w:rPr>
-          <w:rStyle w:val="NormalTok"/>
-        </w:rPr>
-        <w:t xml:space="preserve">    </w:t>
-      </w:r>
-      <w:r>
-        <w:rPr>
-          <w:rStyle w:val="ControlFlowTok"/>
-        </w:rPr>
-        <w:t xml:space="preserve">async</w:t>
-      </w:r>
-      <w:r>
-        <w:rPr>
-          <w:rStyle w:val="NormalTok"/>
-        </w:rPr>
-        <w:t xml:space="preserve"> </w:t>
-      </w:r>
-      <w:r>
-        <w:rPr>
-          <w:rStyle w:val="ControlFlowTok"/>
-        </w:rPr>
-        <w:t xml:space="preserve">with</w:t>
-      </w:r>
-      <w:r>
-        <w:rPr>
-          <w:rStyle w:val="NormalTok"/>
-        </w:rPr>
-        <w:t xml:space="preserve"> db.begin():</w:t>
-      </w:r>
-      <w:r>
-        <w:br/>
-      </w:r>
-      <w:r>
-        <w:rPr>
-          <w:rStyle w:val="NormalTok"/>
-        </w:rPr>
-        <w:t xml:space="preserve">        request </w:t>
-      </w:r>
-      <w:r>
-        <w:rPr>
-          <w:rStyle w:val="OperatorTok"/>
-        </w:rPr>
-        <w:t xml:space="preserve">=</w:t>
-      </w:r>
-      <w:r>
-        <w:rPr>
-          <w:rStyle w:val="NormalTok"/>
-        </w:rPr>
-        <w:t xml:space="preserve"> </w:t>
-      </w:r>
-      <w:r>
-        <w:rPr>
-          <w:rStyle w:val="ControlFlowTok"/>
-        </w:rPr>
-        <w:t xml:space="preserve">await</w:t>
-      </w:r>
-      <w:r>
-        <w:rPr>
-          <w:rStyle w:val="NormalTok"/>
-        </w:rPr>
-        <w:t xml:space="preserve"> db.scalar(</w:t>
-      </w:r>
-      <w:r>
-        <w:br/>
-      </w:r>
-      <w:r>
-        <w:rPr>
-          <w:rStyle w:val="NormalTok"/>
-        </w:rPr>
+        <w:br/>
+        <w:t xml:space="preserve">    idempotency_key: str,</w:t>
+        <w:br/>
+        <w:t>) -&gt; dict:</w:t>
+        <w:br/>
+        <w:t xml:space="preserve">    async with db.begin():</w:t>
+        <w:br/>
+        <w:t xml:space="preserve">        request = await db.scalar(</w:t>
+        <w:br/>
         <w:t xml:space="preserve">            select(ReleaseRequest)</w:t>
-      </w:r>
-      <w:r>
-        <w:br/>
-      </w:r>
-      <w:r>
-        <w:rPr>
-          <w:rStyle w:val="NormalTok"/>
-        </w:rPr>
-        <w:t xml:space="preserve">            .where(ReleaseRequest.</w:t>
-      </w:r>
-      <w:r>
-        <w:rPr>
-          <w:rStyle w:val="BuiltInTok"/>
-        </w:rPr>
-        <w:t xml:space="preserve">id</w:t>
-      </w:r>
-      <w:r>
-        <w:rPr>
-          <w:rStyle w:val="NormalTok"/>
-        </w:rPr>
-        <w:t xml:space="preserve"> </w:t>
-      </w:r>
-      <w:r>
-        <w:rPr>
-          <w:rStyle w:val="OperatorTok"/>
-        </w:rPr>
-        <w:t xml:space="preserve">==</w:t>
-      </w:r>
-      <w:r>
-        <w:rPr>
-          <w:rStyle w:val="NormalTok"/>
-        </w:rPr>
-        <w:t xml:space="preserve"> request_id)</w:t>
-      </w:r>
-      <w:r>
-        <w:br/>
-      </w:r>
-      <w:r>
-        <w:rPr>
-          <w:rStyle w:val="NormalTok"/>
-        </w:rPr>
+        <w:br/>
+        <w:t xml:space="preserve">            .where(ReleaseRequest.id == request_id)</w:t>
+        <w:br/>
         <w:t xml:space="preserve">            .with_for_update()</w:t>
-      </w:r>
-      <w:r>
-        <w:br/>
-      </w:r>
-      <w:r>
-        <w:rPr>
-          <w:rStyle w:val="NormalTok"/>
-        </w:rPr>
+        <w:br/>
         <w:t xml:space="preserve">        )</w:t>
-      </w:r>
-      <w:r>
-        <w:br/>
-      </w:r>
-      <w:r>
-        <w:rPr>
-          <w:rStyle w:val="NormalTok"/>
-        </w:rPr>
-        <w:t xml:space="preserve">        </w:t>
-      </w:r>
-      <w:r>
-        <w:rPr>
-          <w:rStyle w:val="ControlFlowTok"/>
-        </w:rPr>
-        <w:t xml:space="preserve">if</w:t>
-      </w:r>
-      <w:r>
-        <w:rPr>
-          <w:rStyle w:val="NormalTok"/>
-        </w:rPr>
-        <w:t xml:space="preserve"> request </w:t>
-      </w:r>
-      <w:r>
-        <w:rPr>
-          <w:rStyle w:val="KeywordTok"/>
-        </w:rPr>
-        <w:t xml:space="preserve">is</w:t>
-      </w:r>
-      <w:r>
-        <w:rPr>
-          <w:rStyle w:val="NormalTok"/>
-        </w:rPr>
-        <w:t xml:space="preserve"> </w:t>
-      </w:r>
-      <w:r>
-        <w:rPr>
-          <w:rStyle w:val="VariableTok"/>
-        </w:rPr>
-        <w:t xml:space="preserve">None</w:t>
-      </w:r>
-      <w:r>
-        <w:rPr>
-          <w:rStyle w:val="NormalTok"/>
-        </w:rPr>
-        <w:t xml:space="preserve">:</w:t>
-      </w:r>
-      <w:r>
-        <w:br/>
-      </w:r>
-      <w:r>
-        <w:rPr>
-          <w:rStyle w:val="NormalTok"/>
-        </w:rPr>
-        <w:t xml:space="preserve">            </w:t>
-      </w:r>
-      <w:r>
-        <w:rPr>
-          <w:rStyle w:val="ControlFlowTok"/>
-        </w:rPr>
-        <w:t xml:space="preserve">raise</w:t>
-      </w:r>
-      <w:r>
-        <w:rPr>
-          <w:rStyle w:val="NormalTok"/>
-        </w:rPr>
-        <w:t xml:space="preserve"> NotFound(</w:t>
-      </w:r>
-      <w:r>
-        <w:rPr>
-          <w:rStyle w:val="StringTok"/>
-        </w:rPr>
-        <w:t xml:space="preserve">'release request missing'</w:t>
-      </w:r>
-      <w:r>
-        <w:rPr>
-          <w:rStyle w:val="NormalTok"/>
-        </w:rPr>
-        <w:t xml:space="preserve">)</w:t>
-      </w:r>
-      <w:r>
-        <w:br/>
-      </w:r>
-      <w:r>
-        <w:rPr>
-          <w:rStyle w:val="NormalTok"/>
-        </w:rPr>
-        <w:t xml:space="preserve">        </w:t>
-      </w:r>
-      <w:r>
-        <w:rPr>
-          <w:rStyle w:val="CommentTok"/>
-        </w:rPr>
-        <w:t xml:space="preserve"># Resolve and verify current scoped authority HERE.</w:t>
-      </w:r>
-      <w:r>
-        <w:br/>
-      </w:r>
-      <w:r>
-        <w:rPr>
-          <w:rStyle w:val="NormalTok"/>
-        </w:rPr>
-        <w:t xml:space="preserve">        </w:t>
-      </w:r>
-      <w:r>
-        <w:rPr>
-          <w:rStyle w:val="ControlFlowTok"/>
-        </w:rPr>
-        <w:t xml:space="preserve">await</w:t>
-      </w:r>
-      <w:r>
-        <w:rPr>
-          <w:rStyle w:val="NormalTok"/>
-        </w:rPr>
-        <w:t xml:space="preserve"> require_final_approver(db, checker_id, request)</w:t>
-      </w:r>
-      <w:r>
-        <w:br/>
-      </w:r>
-      <w:r>
-        <w:rPr>
-          <w:rStyle w:val="NormalTok"/>
-        </w:rPr>
-        <w:t xml:space="preserve">        receipt </w:t>
-      </w:r>
-      <w:r>
-        <w:rPr>
-          <w:rStyle w:val="OperatorTok"/>
-        </w:rPr>
-        <w:t xml:space="preserve">=</w:t>
-      </w:r>
-      <w:r>
-        <w:rPr>
-          <w:rStyle w:val="NormalTok"/>
-        </w:rPr>
-        <w:t xml:space="preserve"> </w:t>
-      </w:r>
-      <w:r>
-        <w:rPr>
-          <w:rStyle w:val="ControlFlowTok"/>
-        </w:rPr>
-        <w:t xml:space="preserve">await</w:t>
-      </w:r>
-      <w:r>
-        <w:rPr>
-          <w:rStyle w:val="NormalTok"/>
-        </w:rPr>
-        <w:t xml:space="preserve"> find_command_receipt(</w:t>
-      </w:r>
-      <w:r>
-        <w:br/>
-      </w:r>
-      <w:r>
-        <w:rPr>
-          <w:rStyle w:val="NormalTok"/>
-        </w:rPr>
-        <w:t xml:space="preserve">            db, checker_id, idempotency_key, for_update</w:t>
-      </w:r>
-      <w:r>
-        <w:rPr>
-          <w:rStyle w:val="OperatorTok"/>
-        </w:rPr>
-        <w:t xml:space="preserve">=</w:t>
-      </w:r>
-      <w:r>
-        <w:rPr>
-          <w:rStyle w:val="VariableTok"/>
-        </w:rPr>
-        <w:t xml:space="preserve">True</w:t>
-      </w:r>
-      <w:r>
-        <w:br/>
-      </w:r>
-      <w:r>
-        <w:rPr>
-          <w:rStyle w:val="NormalTok"/>
-        </w:rPr>
+        <w:br/>
+        <w:t xml:space="preserve">        if request is None:</w:t>
+        <w:br/>
+        <w:t xml:space="preserve">            raise NotFound('release request missing')</w:t>
+        <w:br/>
+        <w:t xml:space="preserve">        # Resolve and verify current scoped authority HERE.</w:t>
+        <w:br/>
+        <w:t xml:space="preserve">        await require_final_approver(db, checker_id, request)</w:t>
+        <w:br/>
+        <w:t xml:space="preserve">        receipt = await find_command_receipt(</w:t>
+        <w:br/>
+        <w:t xml:space="preserve">            db, checker_id, idempotency_key, for_update=True</w:t>
+        <w:br/>
         <w:t xml:space="preserve">        )</w:t>
-      </w:r>
-      <w:r>
-        <w:br/>
-      </w:r>
-      <w:r>
-        <w:rPr>
-          <w:rStyle w:val="NormalTok"/>
-        </w:rPr>
-        <w:t xml:space="preserve">        </w:t>
-      </w:r>
-      <w:r>
-        <w:rPr>
-          <w:rStyle w:val="ControlFlowTok"/>
-        </w:rPr>
-        <w:t xml:space="preserve">if</w:t>
-      </w:r>
-      <w:r>
-        <w:rPr>
-          <w:rStyle w:val="NormalTok"/>
-        </w:rPr>
-        <w:t xml:space="preserve"> receipt </w:t>
-      </w:r>
-      <w:r>
-        <w:rPr>
-          <w:rStyle w:val="KeywordTok"/>
-        </w:rPr>
-        <w:t xml:space="preserve">is</w:t>
-      </w:r>
-      <w:r>
-        <w:rPr>
-          <w:rStyle w:val="NormalTok"/>
-        </w:rPr>
-        <w:t xml:space="preserve"> </w:t>
-      </w:r>
-      <w:r>
-        <w:rPr>
-          <w:rStyle w:val="KeywordTok"/>
-        </w:rPr>
-        <w:t xml:space="preserve">not</w:t>
-      </w:r>
-      <w:r>
-        <w:rPr>
-          <w:rStyle w:val="NormalTok"/>
-        </w:rPr>
-        <w:t xml:space="preserve"> </w:t>
-      </w:r>
-      <w:r>
-        <w:rPr>
-          <w:rStyle w:val="VariableTok"/>
-        </w:rPr>
-        <w:t xml:space="preserve">None</w:t>
-      </w:r>
-      <w:r>
-        <w:rPr>
-          <w:rStyle w:val="NormalTok"/>
-        </w:rPr>
-        <w:t xml:space="preserve">:</w:t>
-      </w:r>
-      <w:r>
-        <w:br/>
-      </w:r>
-      <w:r>
-        <w:rPr>
-          <w:rStyle w:val="NormalTok"/>
-        </w:rPr>
-        <w:t xml:space="preserve">            </w:t>
-      </w:r>
-      <w:r>
-        <w:rPr>
-          <w:rStyle w:val="ControlFlowTok"/>
-        </w:rPr>
-        <w:t xml:space="preserve">return</w:t>
-      </w:r>
-      <w:r>
-        <w:rPr>
-          <w:rStyle w:val="NormalTok"/>
-        </w:rPr>
-        <w:t xml:space="preserve"> receipt.response  </w:t>
-      </w:r>
-      <w:r>
-        <w:rPr>
-          <w:rStyle w:val="CommentTok"/>
-        </w:rPr>
-        <w:t xml:space="preserve"># May be JSON deserialized</w:t>
-      </w:r>
-      <w:r>
-        <w:br/>
-      </w:r>
-      <w:r>
-        <w:rPr>
-          <w:rStyle w:val="NormalTok"/>
-        </w:rPr>
-        <w:t xml:space="preserve">        </w:t>
-      </w:r>
-      <w:r>
-        <w:rPr>
-          <w:rStyle w:val="ControlFlowTok"/>
-        </w:rPr>
-        <w:t xml:space="preserve">if</w:t>
-      </w:r>
-      <w:r>
-        <w:rPr>
-          <w:rStyle w:val="NormalTok"/>
-        </w:rPr>
-        <w:t xml:space="preserve"> request.prepared_by </w:t>
-      </w:r>
-      <w:r>
-        <w:rPr>
-          <w:rStyle w:val="OperatorTok"/>
-        </w:rPr>
-        <w:t xml:space="preserve">==</w:t>
-      </w:r>
-      <w:r>
-        <w:rPr>
-          <w:rStyle w:val="NormalTok"/>
-        </w:rPr>
-        <w:t xml:space="preserve"> checker_id:</w:t>
-      </w:r>
-      <w:r>
-        <w:br/>
-      </w:r>
-      <w:r>
-        <w:rPr>
-          <w:rStyle w:val="NormalTok"/>
-        </w:rPr>
-        <w:t xml:space="preserve">            </w:t>
-      </w:r>
-      <w:r>
-        <w:rPr>
-          <w:rStyle w:val="ControlFlowTok"/>
-        </w:rPr>
-        <w:t xml:space="preserve">raise</w:t>
-      </w:r>
-      <w:r>
-        <w:rPr>
-          <w:rStyle w:val="NormalTok"/>
-        </w:rPr>
-        <w:t xml:space="preserve"> Conflict(</w:t>
-      </w:r>
-      <w:r>
-        <w:rPr>
-          <w:rStyle w:val="StringTok"/>
-        </w:rPr>
-        <w:t xml:space="preserve">'preparer cannot self-approve'</w:t>
-      </w:r>
-      <w:r>
-        <w:rPr>
-          <w:rStyle w:val="NormalTok"/>
-        </w:rPr>
-        <w:t xml:space="preserve">)</w:t>
-      </w:r>
-      <w:r>
-        <w:br/>
-      </w:r>
-      <w:r>
-        <w:rPr>
-          <w:rStyle w:val="NormalTok"/>
-        </w:rPr>
-        <w:t xml:space="preserve">        </w:t>
-      </w:r>
-      <w:r>
-        <w:rPr>
-          <w:rStyle w:val="ControlFlowTok"/>
-        </w:rPr>
-        <w:t xml:space="preserve">await</w:t>
-      </w:r>
-      <w:r>
-        <w:rPr>
-          <w:rStyle w:val="NormalTok"/>
-        </w:rPr>
-        <w:t xml:space="preserve"> assert_required_clearances(db, request)</w:t>
-      </w:r>
-      <w:r>
-        <w:br/>
-      </w:r>
-      <w:r>
-        <w:rPr>
-          <w:rStyle w:val="NormalTok"/>
-        </w:rPr>
-        <w:t xml:space="preserve">        </w:t>
-      </w:r>
-      <w:r>
-        <w:rPr>
-          <w:rStyle w:val="ControlFlowTok"/>
-        </w:rPr>
-        <w:t xml:space="preserve">await</w:t>
-      </w:r>
-      <w:r>
-        <w:rPr>
-          <w:rStyle w:val="NormalTok"/>
-        </w:rPr>
-        <w:t xml:space="preserve"> assert_current_policy_version(db, request)</w:t>
-      </w:r>
-      <w:r>
-        <w:br/>
-      </w:r>
-      <w:r>
-        <w:rPr>
-          <w:rStyle w:val="NormalTok"/>
-        </w:rPr>
-        <w:t xml:space="preserve">        </w:t>
-      </w:r>
-      <w:r>
-        <w:rPr>
-          <w:rStyle w:val="ControlFlowTok"/>
-        </w:rPr>
-        <w:t xml:space="preserve">if</w:t>
-      </w:r>
-      <w:r>
-        <w:rPr>
-          <w:rStyle w:val="NormalTok"/>
-        </w:rPr>
-        <w:t xml:space="preserve"> request.status </w:t>
-      </w:r>
-      <w:r>
-        <w:rPr>
-          <w:rStyle w:val="OperatorTok"/>
-        </w:rPr>
-        <w:t xml:space="preserve">!=</w:t>
-      </w:r>
-      <w:r>
-        <w:rPr>
-          <w:rStyle w:val="NormalTok"/>
-        </w:rPr>
-        <w:t xml:space="preserve"> </w:t>
-      </w:r>
-      <w:r>
-        <w:rPr>
-          <w:rStyle w:val="StringTok"/>
-        </w:rPr>
-        <w:t xml:space="preserve">'READY_FOR_FINAL_APPROVAL'</w:t>
-      </w:r>
-      <w:r>
-        <w:rPr>
-          <w:rStyle w:val="NormalTok"/>
-        </w:rPr>
-        <w:t xml:space="preserve">:</w:t>
-      </w:r>
-      <w:r>
-        <w:br/>
-      </w:r>
-      <w:r>
-        <w:rPr>
-          <w:rStyle w:val="NormalTok"/>
-        </w:rPr>
-        <w:t xml:space="preserve">            </w:t>
-      </w:r>
-      <w:r>
-        <w:rPr>
-          <w:rStyle w:val="ControlFlowTok"/>
-        </w:rPr>
-        <w:t xml:space="preserve">raise</w:t>
-      </w:r>
-      <w:r>
-        <w:rPr>
-          <w:rStyle w:val="NormalTok"/>
-        </w:rPr>
-        <w:t xml:space="preserve"> Conflict(</w:t>
-      </w:r>
-      <w:r>
-        <w:rPr>
-          <w:rStyle w:val="StringTok"/>
-        </w:rPr>
-        <w:t xml:space="preserve">'request is not ready'</w:t>
-      </w:r>
-      <w:r>
-        <w:rPr>
-          <w:rStyle w:val="NormalTok"/>
-        </w:rPr>
-        <w:t xml:space="preserve">)</w:t>
-      </w:r>
-      <w:r>
-        <w:br/>
-      </w:r>
-      <w:r>
-        <w:rPr>
-          <w:rStyle w:val="NormalTok"/>
-        </w:rPr>
-        <w:t xml:space="preserve">        request.status </w:t>
-      </w:r>
-      <w:r>
-        <w:rPr>
-          <w:rStyle w:val="OperatorTok"/>
-        </w:rPr>
-        <w:t xml:space="preserve">=</w:t>
-      </w:r>
-      <w:r>
-        <w:rPr>
-          <w:rStyle w:val="NormalTok"/>
-        </w:rPr>
-        <w:t xml:space="preserve"> </w:t>
-      </w:r>
-      <w:r>
-        <w:rPr>
-          <w:rStyle w:val="StringTok"/>
-        </w:rPr>
-        <w:t xml:space="preserve">'REQUEST_APPROVED'</w:t>
-      </w:r>
-      <w:r>
-        <w:br/>
-      </w:r>
-      <w:r>
-        <w:rPr>
-          <w:rStyle w:val="NormalTok"/>
-        </w:rPr>
-        <w:t xml:space="preserve">        request.version </w:t>
-      </w:r>
-      <w:r>
-        <w:rPr>
-          <w:rStyle w:val="OperatorTok"/>
-        </w:rPr>
-        <w:t xml:space="preserve">+=</w:t>
-      </w:r>
-      <w:r>
-        <w:rPr>
-          <w:rStyle w:val="NormalTok"/>
-        </w:rPr>
-        <w:t xml:space="preserve"> </w:t>
-      </w:r>
-      <w:r>
-        <w:rPr>
-          <w:rStyle w:val="DecValTok"/>
-        </w:rPr>
-        <w:t xml:space="preserve">1</w:t>
-      </w:r>
-      <w:r>
-        <w:br/>
-      </w:r>
-      <w:r>
-        <w:rPr>
-          <w:rStyle w:val="NormalTok"/>
-        </w:rPr>
+        <w:br/>
+        <w:t xml:space="preserve">        if receipt is not None:</w:t>
+        <w:br/>
+        <w:t xml:space="preserve">            return receipt.response  # May be JSON deserialized</w:t>
+        <w:br/>
+        <w:t xml:space="preserve">        if request.prepared_by == checker_id:</w:t>
+        <w:br/>
+        <w:t xml:space="preserve">            raise Conflict('preparer cannot self-approve')</w:t>
+        <w:br/>
+        <w:t xml:space="preserve">        await assert_required_clearances(db, request)</w:t>
+        <w:br/>
+        <w:t xml:space="preserve">        await assert_current_policy_version(db, request)</w:t>
+        <w:br/>
+        <w:t xml:space="preserve">        if request.status != 'READY_FOR_DECISION':</w:t>
+        <w:br/>
+        <w:t xml:space="preserve">            raise Conflict('request is not ready')</w:t>
+        <w:br/>
+        <w:t xml:space="preserve">        request.status = 'APPROVED'</w:t>
+        <w:br/>
+        <w:t xml:space="preserve">        request.version += 1</w:t>
+        <w:br/>
         <w:t xml:space="preserve">        db.add(AuditEvent.from_release(request, checker_id))</w:t>
-      </w:r>
-      <w:r>
-        <w:br/>
-      </w:r>
-      <w:r>
-        <w:rPr>
-          <w:rStyle w:val="NormalTok"/>
-        </w:rPr>
-        <w:t xml:space="preserve">        db.add(OutboxEvent.release_decided(request.</w:t>
-      </w:r>
-      <w:r>
-        <w:rPr>
-          <w:rStyle w:val="BuiltInTok"/>
-        </w:rPr>
-        <w:t xml:space="preserve">id</w:t>
-      </w:r>
-      <w:r>
-        <w:rPr>
-          <w:rStyle w:val="NormalTok"/>
-        </w:rPr>
-        <w:t xml:space="preserve">))</w:t>
-      </w:r>
-      <w:r>
-        <w:br/>
-      </w:r>
-      <w:r>
-        <w:rPr>
-          <w:rStyle w:val="NormalTok"/>
-        </w:rPr>
-        <w:t xml:space="preserve">        response </w:t>
-      </w:r>
-      <w:r>
-        <w:rPr>
-          <w:rStyle w:val="OperatorTok"/>
-        </w:rPr>
-        <w:t xml:space="preserve">=</w:t>
-      </w:r>
-      <w:r>
-        <w:rPr>
-          <w:rStyle w:val="NormalTok"/>
-        </w:rPr>
-        <w:t xml:space="preserve"> {</w:t>
-      </w:r>
-      <w:r>
-        <w:rPr>
-          <w:rStyle w:val="StringTok"/>
-        </w:rPr>
-        <w:t xml:space="preserve">'id'</w:t>
-      </w:r>
-      <w:r>
-        <w:rPr>
-          <w:rStyle w:val="NormalTok"/>
-        </w:rPr>
-        <w:t xml:space="preserve">: </w:t>
-      </w:r>
-      <w:r>
-        <w:rPr>
-          <w:rStyle w:val="BuiltInTok"/>
-        </w:rPr>
-        <w:t xml:space="preserve">str</w:t>
-      </w:r>
-      <w:r>
-        <w:rPr>
-          <w:rStyle w:val="NormalTok"/>
-        </w:rPr>
-        <w:t xml:space="preserve">(request.</w:t>
-      </w:r>
-      <w:r>
-        <w:rPr>
-          <w:rStyle w:val="BuiltInTok"/>
-        </w:rPr>
-        <w:t xml:space="preserve">id</w:t>
-      </w:r>
-      <w:r>
-        <w:rPr>
-          <w:rStyle w:val="NormalTok"/>
-        </w:rPr>
-        <w:t xml:space="preserve">), </w:t>
-      </w:r>
-      <w:r>
-        <w:rPr>
-          <w:rStyle w:val="StringTok"/>
-        </w:rPr>
-        <w:t xml:space="preserve">'status'</w:t>
-      </w:r>
-      <w:r>
-        <w:rPr>
-          <w:rStyle w:val="NormalTok"/>
-        </w:rPr>
-        <w:t xml:space="preserve">: request.status}</w:t>
-      </w:r>
-      <w:r>
-        <w:br/>
-      </w:r>
-      <w:r>
-        <w:rPr>
-          <w:rStyle w:val="NormalTok"/>
-        </w:rPr>
-        <w:t xml:space="preserve">        </w:t>
-      </w:r>
-      <w:r>
-        <w:rPr>
-          <w:rStyle w:val="ControlFlowTok"/>
-        </w:rPr>
-        <w:t xml:space="preserve">await</w:t>
-      </w:r>
-      <w:r>
-        <w:rPr>
-          <w:rStyle w:val="NormalTok"/>
-        </w:rPr>
-        <w:t xml:space="preserve"> store_unique_receipt(</w:t>
-      </w:r>
-      <w:r>
-        <w:br/>
-      </w:r>
-      <w:r>
-        <w:rPr>
-          <w:rStyle w:val="NormalTok"/>
-        </w:rPr>
+        <w:br/>
+        <w:t xml:space="preserve">        db.add(OutboxEvent.release_decided(request.id))</w:t>
+        <w:br/>
+        <w:t xml:space="preserve">        response = {'id': str(request.id), 'status': request.status}</w:t>
+        <w:br/>
+        <w:t xml:space="preserve">        await store_unique_receipt(</w:t>
+        <w:br/>
         <w:t xml:space="preserve">            db, checker_id, idempotency_key, response</w:t>
-      </w:r>
-      <w:r>
-        <w:br/>
-      </w:r>
-      <w:r>
-        <w:rPr>
-          <w:rStyle w:val="NormalTok"/>
-        </w:rPr>
+        <w:br/>
         <w:t xml:space="preserve">        )</w:t>
-      </w:r>
-      <w:r>
-        <w:br/>
-      </w:r>
-      <w:r>
-        <w:rPr>
-          <w:rStyle w:val="NormalTok"/>
-        </w:rPr>
-        <w:t xml:space="preserve">        </w:t>
-      </w:r>
-      <w:r>
-        <w:rPr>
-          <w:rStyle w:val="ControlFlowTok"/>
-        </w:rPr>
-        <w:t xml:space="preserve">return</w:t>
-      </w:r>
-      <w:r>
-        <w:rPr>
-          <w:rStyle w:val="NormalTok"/>
-        </w:rPr>
-        <w:t xml:space="preserve"> response</w:t>
+        <w:br/>
+        <w:t xml:space="preserve">        return response</w:t>
       </w:r>
     </w:p>
     <w:p>

</xml_diff>